<commit_message>
Add division/rational-root sections to Cornell notes and a comprehensive Unit 2 review
Co-Authored-By: Claude Sonnet 5.5 <noreply@anthropic.com>
Claude-Session: https://claude.ai/code/session_01H9guSUwxHhXVKeohbtcfGx
</commit_message>
<xml_diff>
--- a/Unit2-Polynomials-Cornell-Notes.docx
+++ b/Unit2-Polynomials-Cornell-Notes.docx
@@ -30,7 +30,7 @@
           <w:sz w:val="21"/>
           <w:szCs w:val="21"/>
         </w:rPr>
-        <w:t xml:space="preserve">Algebra 2 | Unit 2 Test Review (Test 26–27) | Quadratics, polynomial operations, end behavior, zeros, graphing</w:t>
+        <w:t xml:space="preserve">Algebra 2 | Unit 2 Test Review (Test 26–27) | Quadratics, polynomial operations, end behavior, zeros, graphing, division</w:t>
       </w:r>
     </w:p>
     <w:p>
@@ -66,7 +66,7 @@
           <w:sz w:val="21"/>
           <w:szCs w:val="21"/>
         </w:rPr>
-        <w:t xml:space="preserve"> Solve quadratics (factoring, quadratic formula) • Multiply and add polynomials • Determine end behavior • Write polynomials from zeros and use the Factor Theorem • Find intercepts and sketch a polynomial graph.</w:t>
+        <w:t xml:space="preserve"> Solve quadratics (factoring, quadratic formula) • Multiply and add polynomials • Determine end behavior • Write polynomials from zeros and use the Factor Theorem • Find intercepts and sketch a polynomial graph • Divide polynomials (long and synthetic division) and find roots with the Rational Root Theorem.</w:t>
       </w:r>
     </w:p>
     <w:p>
@@ -268,6 +268,68 @@
     </w:p>
     <w:p>
       <w:pPr>
+        <w:keepNext/>
+        <w:spacing w:after="10"/>
+      </w:pPr>
+      <w:r>
+        <w:rPr>
+          <w:rFonts w:ascii="Calibri" w:cs="Calibri" w:eastAsia="Calibri" w:hAnsi="Calibri"/>
+          <w:b/>
+          <w:bCs/>
+          <w:color w:val="1F3864"/>
+          <w:sz w:val="20"/>
+          <w:szCs w:val="20"/>
+        </w:rPr>
+        <w:t xml:space="preserve">6. Polynomial Division (Long &amp; Synthetic)</w:t>
+      </w:r>
+    </w:p>
+    <w:p>
+      <w:pPr>
+        <w:spacing w:after="60"/>
+        <w:ind w:left="240"/>
+      </w:pPr>
+      <w:r>
+        <w:rPr>
+          <w:rFonts w:ascii="Calibri" w:cs="Calibri" w:eastAsia="Calibri" w:hAnsi="Calibri"/>
+          <w:sz w:val="17"/>
+          <w:szCs w:val="17"/>
+        </w:rPr>
+        <w:t xml:space="preserve">How do I do polynomial long division? • When can I use synthetic division, and how? • What about missing terms and negative c? • How does the remainder connect to the Factor Theorem? • How do I find all the roots of a cubic?</w:t>
+      </w:r>
+    </w:p>
+    <w:p>
+      <w:pPr>
+        <w:keepNext/>
+        <w:spacing w:after="10"/>
+      </w:pPr>
+      <w:r>
+        <w:rPr>
+          <w:rFonts w:ascii="Calibri" w:cs="Calibri" w:eastAsia="Calibri" w:hAnsi="Calibri"/>
+          <w:b/>
+          <w:bCs/>
+          <w:color w:val="1F3864"/>
+          <w:sz w:val="20"/>
+          <w:szCs w:val="20"/>
+        </w:rPr>
+        <w:t xml:space="preserve">7. More Practice (Review Stations)</w:t>
+      </w:r>
+    </w:p>
+    <w:p>
+      <w:pPr>
+        <w:spacing w:after="60"/>
+        <w:ind w:left="240"/>
+      </w:pPr>
+      <w:r>
+        <w:rPr>
+          <w:rFonts w:ascii="Calibri" w:cs="Calibri" w:eastAsia="Calibri" w:hAnsi="Calibri"/>
+          <w:sz w:val="17"/>
+          <w:szCs w:val="17"/>
+        </w:rPr>
+        <w:t xml:space="preserve">Writing a polynomial from zeros in standard form • Rational equation with extraneous check • Quadratics two ways + features • Factoring practice (Kuta worksheet)</w:t>
+      </w:r>
+    </w:p>
+    <w:p>
+      <w:pPr>
         <w:spacing w:after="0"/>
       </w:pPr>
       <w:r>
@@ -2448,235 +2510,28 @@
               <w:bottom w:val="single" w:color="8EAADB" w:sz="4"/>
               <w:right w:val="single" w:color="8EAADB" w:sz="4"/>
             </w:tcBorders>
-            <w:shd w:fill="E2EFDA" w:color="auto" w:val="clear"/>
-            <w:tcMar>
-              <w:top w:type="dxa" w:w="60"/>
-              <w:left w:type="dxa" w:w="100"/>
-              <w:bottom w:type="dxa" w:w="60"/>
-              <w:right w:type="dxa" w:w="100"/>
-            </w:tcMar>
-          </w:tcPr>
-          <w:p>
+            <w:shd w:fill="D9E2F3" w:color="auto" w:val="clear"/>
+            <w:tcMar>
+              <w:top w:type="dxa" w:w="60"/>
+              <w:left w:type="dxa" w:w="100"/>
+              <w:bottom w:type="dxa" w:w="60"/>
+              <w:right w:type="dxa" w:w="100"/>
+            </w:tcMar>
+          </w:tcPr>
+          <w:p>
+            <w:pPr>
+              <w:keepNext/>
+            </w:pPr>
             <w:r>
               <w:rPr>
                 <w:rFonts w:ascii="Calibri" w:cs="Calibri" w:eastAsia="Calibri" w:hAnsi="Calibri"/>
                 <w:b/>
                 <w:bCs/>
                 <w:color w:val="1F3864"/>
-                <w:sz w:val="22"/>
-                <w:szCs w:val="22"/>
-              </w:rPr>
-              <w:t xml:space="preserve">MEMORY TRICKS</w:t>
-            </w:r>
-          </w:p>
-          <w:p>
-            <w:pPr>
-              <w:spacing w:after="40"/>
-              <w:ind w:left="240" w:hanging="180"/>
-            </w:pPr>
-            <w:r>
-              <w:rPr>
-                <w:rFonts w:ascii="Calibri" w:cs="Calibri" w:eastAsia="Calibri" w:hAnsi="Calibri"/>
-                <w:sz w:val="21"/>
-                <w:szCs w:val="21"/>
-              </w:rPr>
-              <w:t xml:space="preserve">• </w:t>
-            </w:r>
-            <w:r>
-              <w:rPr>
-                <w:rFonts w:ascii="Calibri" w:cs="Calibri" w:eastAsia="Calibri" w:hAnsi="Calibri"/>
-                <w:b/>
-                <w:bCs/>
-                <w:sz w:val="21"/>
-                <w:szCs w:val="21"/>
-              </w:rPr>
-              <w:t xml:space="preserve">Factor ↔ zero</w:t>
-            </w:r>
-            <w:r>
-              <w:rPr>
-                <w:rFonts w:ascii="Calibri" w:cs="Calibri" w:eastAsia="Calibri" w:hAnsi="Calibri"/>
-                <w:sz w:val="21"/>
-                <w:szCs w:val="21"/>
-              </w:rPr>
-              <w:t xml:space="preserve">: (x − 3) means zero at x = </w:t>
-            </w:r>
-            <w:r>
-              <w:rPr>
-                <w:rFonts w:ascii="Calibri" w:cs="Calibri" w:eastAsia="Calibri" w:hAnsi="Calibri"/>
-                <w:b/>
-                <w:bCs/>
-                <w:sz w:val="21"/>
-                <w:szCs w:val="21"/>
-              </w:rPr>
-              <w:t xml:space="preserve">+</w:t>
-            </w:r>
-            <w:r>
-              <w:rPr>
-                <w:rFonts w:ascii="Calibri" w:cs="Calibri" w:eastAsia="Calibri" w:hAnsi="Calibri"/>
-                <w:sz w:val="21"/>
-                <w:szCs w:val="21"/>
-              </w:rPr>
-              <w:t xml:space="preserve">3 — flip the sign.</w:t>
-            </w:r>
-          </w:p>
-          <w:p>
-            <w:pPr>
-              <w:spacing w:after="40"/>
-              <w:ind w:left="240" w:hanging="180"/>
-            </w:pPr>
-            <w:r>
-              <w:rPr>
-                <w:rFonts w:ascii="Calibri" w:cs="Calibri" w:eastAsia="Calibri" w:hAnsi="Calibri"/>
-                <w:sz w:val="21"/>
-                <w:szCs w:val="21"/>
-              </w:rPr>
-              <w:t xml:space="preserve">• </w:t>
-            </w:r>
-            <w:r>
-              <w:rPr>
-                <w:rFonts w:ascii="Calibri" w:cs="Calibri" w:eastAsia="Calibri" w:hAnsi="Calibri"/>
-                <w:b/>
-                <w:bCs/>
-                <w:sz w:val="21"/>
-                <w:szCs w:val="21"/>
-              </w:rPr>
-              <w:t xml:space="preserve">Even = Equal ends</w:t>
-            </w:r>
-            <w:r>
-              <w:rPr>
-                <w:rFonts w:ascii="Calibri" w:cs="Calibri" w:eastAsia="Calibri" w:hAnsi="Calibri"/>
-                <w:sz w:val="21"/>
-                <w:szCs w:val="21"/>
-              </w:rPr>
-              <w:t xml:space="preserve">, Odd = Opposite ends.</w:t>
-            </w:r>
-          </w:p>
-          <w:p>
-            <w:pPr>
-              <w:spacing w:after="40"/>
-              <w:ind w:left="240" w:hanging="180"/>
-            </w:pPr>
-            <w:r>
-              <w:rPr>
-                <w:rFonts w:ascii="Calibri" w:cs="Calibri" w:eastAsia="Calibri" w:hAnsi="Calibri"/>
-                <w:sz w:val="21"/>
-                <w:szCs w:val="21"/>
-              </w:rPr>
-              <w:t xml:space="preserve">• </w:t>
-            </w:r>
-            <w:r>
-              <w:rPr>
-                <w:rFonts w:ascii="Calibri" w:cs="Calibri" w:eastAsia="Calibri" w:hAnsi="Calibri"/>
-                <w:b/>
-                <w:bCs/>
-                <w:sz w:val="21"/>
-                <w:szCs w:val="21"/>
-              </w:rPr>
-              <w:t xml:space="preserve">Even multiplicity = bounce</w:t>
-            </w:r>
-            <w:r>
-              <w:rPr>
-                <w:rFonts w:ascii="Calibri" w:cs="Calibri" w:eastAsia="Calibri" w:hAnsi="Calibri"/>
-                <w:sz w:val="21"/>
-                <w:szCs w:val="21"/>
-              </w:rPr>
-              <w:t xml:space="preserve">, odd = cross.</w:t>
-            </w:r>
-          </w:p>
-          <w:p>
-            <w:pPr>
-              <w:spacing w:after="40"/>
-              <w:ind w:left="240" w:hanging="180"/>
-            </w:pPr>
-            <w:r>
-              <w:rPr>
-                <w:rFonts w:ascii="Calibri" w:cs="Calibri" w:eastAsia="Calibri" w:hAnsi="Calibri"/>
-                <w:sz w:val="21"/>
-                <w:szCs w:val="21"/>
-              </w:rPr>
-              <w:t xml:space="preserve">• </w:t>
-            </w:r>
-            <w:r>
-              <w:rPr>
-                <w:rFonts w:ascii="Calibri" w:cs="Calibri" w:eastAsia="Calibri" w:hAnsi="Calibri"/>
-                <w:b/>
-                <w:bCs/>
-                <w:sz w:val="21"/>
-                <w:szCs w:val="21"/>
-              </w:rPr>
-              <w:t xml:space="preserve">Quadratic formula song</w:t>
-            </w:r>
-            <w:r>
-              <w:rPr>
-                <w:rFonts w:ascii="Calibri" w:cs="Calibri" w:eastAsia="Calibri" w:hAnsi="Calibri"/>
-                <w:sz w:val="21"/>
-                <w:szCs w:val="21"/>
-              </w:rPr>
-              <w:t xml:space="preserve">: "x equals negative b, plus or minus the square root of b squared minus 4ac, all over 2a."</w:t>
-            </w:r>
-          </w:p>
-          <w:p>
-            <w:pPr>
-              <w:spacing w:after="40"/>
-              <w:ind w:left="240" w:hanging="180"/>
-            </w:pPr>
-            <w:r>
-              <w:rPr>
-                <w:rFonts w:ascii="Calibri" w:cs="Calibri" w:eastAsia="Calibri" w:hAnsi="Calibri"/>
-                <w:sz w:val="21"/>
-                <w:szCs w:val="21"/>
-              </w:rPr>
-              <w:t xml:space="preserve">• </w:t>
-            </w:r>
-            <w:r>
-              <w:rPr>
-                <w:rFonts w:ascii="Calibri" w:cs="Calibri" w:eastAsia="Calibri" w:hAnsi="Calibri"/>
-                <w:b/>
-                <w:bCs/>
-                <w:sz w:val="21"/>
-                <w:szCs w:val="21"/>
-              </w:rPr>
-              <w:t xml:space="preserve">Set = 0 before factoring</w:t>
-            </w:r>
-            <w:r>
-              <w:rPr>
-                <w:rFonts w:ascii="Calibri" w:cs="Calibri" w:eastAsia="Calibri" w:hAnsi="Calibri"/>
-                <w:sz w:val="21"/>
-                <w:szCs w:val="21"/>
-              </w:rPr>
-              <w:t xml:space="preserve"> — no zero, no zero-product rule.</w:t>
-            </w:r>
-          </w:p>
-          <w:p>
-            <w:pPr>
-              <w:spacing w:after="40"/>
-              <w:ind w:left="240" w:hanging="180"/>
-            </w:pPr>
-            <w:r>
-              <w:rPr>
-                <w:rFonts w:ascii="Calibri" w:cs="Calibri" w:eastAsia="Calibri" w:hAnsi="Calibri"/>
-                <w:sz w:val="21"/>
-                <w:szCs w:val="21"/>
-              </w:rPr>
-              <w:t xml:space="preserve">• </w:t>
-            </w:r>
-            <w:r>
-              <w:rPr>
-                <w:rFonts w:ascii="Calibri" w:cs="Calibri" w:eastAsia="Calibri" w:hAnsi="Calibri"/>
-                <w:b/>
-                <w:bCs/>
-                <w:sz w:val="21"/>
-                <w:szCs w:val="21"/>
-              </w:rPr>
-              <w:t xml:space="preserve">Factor Theorem</w:t>
-            </w:r>
-            <w:r>
-              <w:rPr>
-                <w:rFonts w:ascii="Calibri" w:cs="Calibri" w:eastAsia="Calibri" w:hAnsi="Calibri"/>
-                <w:sz w:val="21"/>
-                <w:szCs w:val="21"/>
-              </w:rPr>
-              <w:t xml:space="preserve">: (x − c) is a factor ⇔ plug in c, get 0.</w:t>
+                <w:sz w:val="24"/>
+                <w:szCs w:val="24"/>
+              </w:rPr>
+              <w:t xml:space="preserve">6. Polynomial Division (Long &amp; Synthetic)</w:t>
             </w:r>
           </w:p>
         </w:tc>
@@ -2687,6 +2542,815 @@
         </w:trPr>
         <w:tc>
           <w:tcPr>
+            <w:tcW w:type="dxa" w:w="2700"/>
+            <w:tcBorders>
+              <w:top w:val="single" w:color="8EAADB" w:sz="4"/>
+              <w:left w:val="single" w:color="8EAADB" w:sz="4"/>
+              <w:bottom w:val="single" w:color="8EAADB" w:sz="4"/>
+              <w:right w:val="single" w:color="8EAADB" w:sz="4"/>
+            </w:tcBorders>
+            <w:shd w:fill="EEF3FA" w:color="auto" w:val="clear"/>
+            <w:tcMar>
+              <w:top w:type="dxa" w:w="60"/>
+              <w:left w:type="dxa" w:w="100"/>
+              <w:bottom w:type="dxa" w:w="60"/>
+              <w:right w:type="dxa" w:w="100"/>
+            </w:tcMar>
+          </w:tcPr>
+          <w:p>
+            <w:r>
+              <w:rPr>
+                <w:rFonts w:ascii="Calibri" w:cs="Calibri" w:eastAsia="Calibri" w:hAnsi="Calibri"/>
+                <w:b/>
+                <w:bCs/>
+                <w:color w:val="1F3864"/>
+                <w:sz w:val="21"/>
+                <w:szCs w:val="21"/>
+              </w:rPr>
+              <w:t xml:space="preserve">How do I do polynomial long division?</w:t>
+            </w:r>
+          </w:p>
+        </w:tc>
+        <w:tc>
+          <w:tcPr>
+            <w:tcW w:type="dxa" w:w="6660"/>
+            <w:tcBorders>
+              <w:top w:val="single" w:color="8EAADB" w:sz="4"/>
+              <w:left w:val="single" w:color="8EAADB" w:sz="4"/>
+              <w:bottom w:val="single" w:color="8EAADB" w:sz="4"/>
+              <w:right w:val="single" w:color="8EAADB" w:sz="4"/>
+            </w:tcBorders>
+            <w:tcMar>
+              <w:top w:type="dxa" w:w="60"/>
+              <w:left w:type="dxa" w:w="100"/>
+              <w:bottom w:type="dxa" w:w="60"/>
+              <w:right w:type="dxa" w:w="100"/>
+            </w:tcMar>
+          </w:tcPr>
+          <w:p>
+            <w:pPr>
+              <w:spacing w:after="60"/>
+            </w:pPr>
+            <w:r>
+              <w:rPr>
+                <w:rFonts w:ascii="Calibri" w:cs="Calibri" w:eastAsia="Calibri" w:hAnsi="Calibri"/>
+                <w:sz w:val="21"/>
+                <w:szCs w:val="21"/>
+              </w:rPr>
+              <w:t xml:space="preserve">Same steps as number long division: divide leading terms → multiply → subtract (change signs!) → bring down → repeat. Insert </w:t>
+            </w:r>
+            <w:r>
+              <w:rPr>
+                <w:rFonts w:ascii="Calibri" w:cs="Calibri" w:eastAsia="Calibri" w:hAnsi="Calibri"/>
+                <w:b/>
+                <w:bCs/>
+                <w:sz w:val="21"/>
+                <w:szCs w:val="21"/>
+              </w:rPr>
+              <w:t xml:space="preserve">0</w:t>
+            </w:r>
+            <w:r>
+              <w:rPr>
+                <w:rFonts w:ascii="Calibri" w:cs="Calibri" w:eastAsia="Calibri" w:hAnsi="Calibri"/>
+                <w:sz w:val="21"/>
+                <w:szCs w:val="21"/>
+              </w:rPr>
+              <w:t xml:space="preserve"> placeholders for missing powers.</w:t>
+            </w:r>
+          </w:p>
+          <w:p>
+            <w:pPr>
+              <w:spacing w:after="60"/>
+            </w:pPr>
+            <w:r>
+              <w:rPr>
+                <w:rFonts w:ascii="Calibri" w:cs="Calibri" w:eastAsia="Calibri" w:hAnsi="Calibri"/>
+                <w:sz w:val="21"/>
+                <w:szCs w:val="21"/>
+              </w:rPr>
+              <w:t xml:space="preserve">Class example: (6a³ + 20a² − 15a + 9) ÷ (a + 4)</w:t>
+            </w:r>
+          </w:p>
+          <w:p>
+            <w:pPr>
+              <w:spacing w:after="60"/>
+            </w:pPr>
+            <w:r>
+              <w:rPr>
+                <w:rFonts w:ascii="Calibri" w:cs="Calibri" w:eastAsia="Calibri" w:hAnsi="Calibri"/>
+                <w:sz w:val="21"/>
+                <w:szCs w:val="21"/>
+              </w:rPr>
+              <w:t xml:space="preserve">6a³ ÷ a = 6a² → subtract 6a³ + 24a² → −4a² − 15a → −4a → subtract −4a² − 16a → a + 9 → +1 → subtract a + 4 → remainder 5.</w:t>
+            </w:r>
+          </w:p>
+          <w:p>
+            <w:pPr>
+              <w:spacing w:after="60"/>
+            </w:pPr>
+            <w:r>
+              <w:rPr>
+                <w:rFonts w:ascii="Calibri" w:cs="Calibri" w:eastAsia="Calibri" w:hAnsi="Calibri"/>
+                <w:b/>
+                <w:bCs/>
+                <w:sz w:val="21"/>
+                <w:szCs w:val="21"/>
+              </w:rPr>
+              <w:t xml:space="preserve">= 6a² − 4a + 1 + 5/(a + 4)</w:t>
+            </w:r>
+            <w:r>
+              <w:rPr>
+                <w:rFonts w:ascii="Calibri" w:cs="Calibri" w:eastAsia="Calibri" w:hAnsi="Calibri"/>
+                <w:sz w:val="21"/>
+                <w:szCs w:val="21"/>
+              </w:rPr>
+              <w:t xml:space="preserve">  (answer form: quotient + remainder/divisor)</w:t>
+            </w:r>
+          </w:p>
+        </w:tc>
+      </w:tr>
+      <w:tr>
+        <w:trPr>
+          <w:cantSplit/>
+        </w:trPr>
+        <w:tc>
+          <w:tcPr>
+            <w:tcW w:type="dxa" w:w="2700"/>
+            <w:tcBorders>
+              <w:top w:val="single" w:color="8EAADB" w:sz="4"/>
+              <w:left w:val="single" w:color="8EAADB" w:sz="4"/>
+              <w:bottom w:val="single" w:color="8EAADB" w:sz="4"/>
+              <w:right w:val="single" w:color="8EAADB" w:sz="4"/>
+            </w:tcBorders>
+            <w:shd w:fill="EEF3FA" w:color="auto" w:val="clear"/>
+            <w:tcMar>
+              <w:top w:type="dxa" w:w="60"/>
+              <w:left w:type="dxa" w:w="100"/>
+              <w:bottom w:type="dxa" w:w="60"/>
+              <w:right w:type="dxa" w:w="100"/>
+            </w:tcMar>
+          </w:tcPr>
+          <w:p>
+            <w:r>
+              <w:rPr>
+                <w:rFonts w:ascii="Calibri" w:cs="Calibri" w:eastAsia="Calibri" w:hAnsi="Calibri"/>
+                <w:b/>
+                <w:bCs/>
+                <w:color w:val="1F3864"/>
+                <w:sz w:val="21"/>
+                <w:szCs w:val="21"/>
+              </w:rPr>
+              <w:t xml:space="preserve">When can I use synthetic division, and how?</w:t>
+            </w:r>
+          </w:p>
+        </w:tc>
+        <w:tc>
+          <w:tcPr>
+            <w:tcW w:type="dxa" w:w="6660"/>
+            <w:tcBorders>
+              <w:top w:val="single" w:color="8EAADB" w:sz="4"/>
+              <w:left w:val="single" w:color="8EAADB" w:sz="4"/>
+              <w:bottom w:val="single" w:color="8EAADB" w:sz="4"/>
+              <w:right w:val="single" w:color="8EAADB" w:sz="4"/>
+            </w:tcBorders>
+            <w:tcMar>
+              <w:top w:type="dxa" w:w="60"/>
+              <w:left w:type="dxa" w:w="100"/>
+              <w:bottom w:type="dxa" w:w="60"/>
+              <w:right w:type="dxa" w:w="100"/>
+            </w:tcMar>
+          </w:tcPr>
+          <w:p>
+            <w:pPr>
+              <w:spacing w:after="60"/>
+            </w:pPr>
+            <w:r>
+              <w:rPr>
+                <w:rFonts w:ascii="Calibri" w:cs="Calibri" w:eastAsia="Calibri" w:hAnsi="Calibri"/>
+                <w:sz w:val="21"/>
+                <w:szCs w:val="21"/>
+              </w:rPr>
+              <w:t xml:space="preserve">Only when dividing by a </w:t>
+            </w:r>
+            <w:r>
+              <w:rPr>
+                <w:rFonts w:ascii="Calibri" w:cs="Calibri" w:eastAsia="Calibri" w:hAnsi="Calibri"/>
+                <w:b/>
+                <w:bCs/>
+                <w:sz w:val="21"/>
+                <w:szCs w:val="21"/>
+              </w:rPr>
+              <w:t xml:space="preserve">linear</w:t>
+            </w:r>
+            <w:r>
+              <w:rPr>
+                <w:rFonts w:ascii="Calibri" w:cs="Calibri" w:eastAsia="Calibri" w:hAnsi="Calibri"/>
+                <w:sz w:val="21"/>
+                <w:szCs w:val="21"/>
+              </w:rPr>
+              <w:t xml:space="preserve"> factor (x − c). Use </w:t>
+            </w:r>
+            <w:r>
+              <w:rPr>
+                <w:rFonts w:ascii="Calibri" w:cs="Calibri" w:eastAsia="Calibri" w:hAnsi="Calibri"/>
+                <w:b/>
+                <w:bCs/>
+                <w:sz w:val="21"/>
+                <w:szCs w:val="21"/>
+              </w:rPr>
+              <w:t xml:space="preserve">c</w:t>
+            </w:r>
+            <w:r>
+              <w:rPr>
+                <w:rFonts w:ascii="Calibri" w:cs="Calibri" w:eastAsia="Calibri" w:hAnsi="Calibri"/>
+                <w:sz w:val="21"/>
+                <w:szCs w:val="21"/>
+              </w:rPr>
+              <w:t xml:space="preserve"> (opposite sign of the divisor's number): x − 2 → c = 2; x + 6 → c = −6.</w:t>
+            </w:r>
+          </w:p>
+          <w:p>
+            <w:pPr>
+              <w:spacing w:after="60"/>
+            </w:pPr>
+            <w:r>
+              <w:rPr>
+                <w:rFonts w:ascii="Calibri" w:cs="Calibri" w:eastAsia="Calibri" w:hAnsi="Calibri"/>
+                <w:b/>
+                <w:bCs/>
+                <w:sz w:val="21"/>
+                <w:szCs w:val="21"/>
+              </w:rPr>
+              <w:t xml:space="preserve">Steps:</w:t>
+            </w:r>
+            <w:r>
+              <w:rPr>
+                <w:rFonts w:ascii="Calibri" w:cs="Calibri" w:eastAsia="Calibri" w:hAnsi="Calibri"/>
+                <w:sz w:val="21"/>
+                <w:szCs w:val="21"/>
+              </w:rPr>
+              <w:t xml:space="preserve"> (1) write coefficients in order, 0 for any missing power; (2) bring down the first coefficient; (3) multiply by c, write under the next coefficient; (4) add the column; (5) repeat. The last number is the </w:t>
+            </w:r>
+            <w:r>
+              <w:rPr>
+                <w:rFonts w:ascii="Calibri" w:cs="Calibri" w:eastAsia="Calibri" w:hAnsi="Calibri"/>
+                <w:b/>
+                <w:bCs/>
+                <w:sz w:val="21"/>
+                <w:szCs w:val="21"/>
+              </w:rPr>
+              <w:t xml:space="preserve">remainder</w:t>
+            </w:r>
+            <w:r>
+              <w:rPr>
+                <w:rFonts w:ascii="Calibri" w:cs="Calibri" w:eastAsia="Calibri" w:hAnsi="Calibri"/>
+                <w:sz w:val="21"/>
+                <w:szCs w:val="21"/>
+              </w:rPr>
+              <w:t xml:space="preserve">; the others are the quotient coefficients (one degree lower).</w:t>
+            </w:r>
+          </w:p>
+          <w:p>
+            <w:pPr>
+              <w:spacing w:after="60"/>
+            </w:pPr>
+            <w:r>
+              <w:rPr>
+                <w:rFonts w:ascii="Calibri" w:cs="Calibri" w:eastAsia="Calibri" w:hAnsi="Calibri"/>
+                <w:b/>
+                <w:bCs/>
+                <w:sz w:val="21"/>
+                <w:szCs w:val="21"/>
+              </w:rPr>
+              <w:t xml:space="preserve">Station 1</w:t>
+            </w:r>
+            <w:r>
+              <w:rPr>
+                <w:rFonts w:ascii="Calibri" w:cs="Calibri" w:eastAsia="Calibri" w:hAnsi="Calibri"/>
+                <w:sz w:val="21"/>
+                <w:szCs w:val="21"/>
+              </w:rPr>
+              <w:t xml:space="preserve"> (3x⁴ − 5x³ + 2x² − x + 6) ÷ (x − 2), c = 2:</w:t>
+            </w:r>
+          </w:p>
+          <w:p>
+            <w:pPr>
+              <w:spacing w:after="60"/>
+            </w:pPr>
+            <w:r>
+              <w:rPr>
+                <w:rFonts w:ascii="Calibri" w:cs="Calibri" w:eastAsia="Calibri" w:hAnsi="Calibri"/>
+                <w:sz w:val="21"/>
+                <w:szCs w:val="21"/>
+              </w:rPr>
+              <w:t xml:space="preserve">3 | −5 | 2 | −1 | 6 → bring down 3; 3·2 = 6, −5 + 6 = 1; 1·2 = 2, 2 + 2 = 4; 4·2 = 8, −1 + 8 = 7; 7·2 = 14, 6 + 14 = 20</w:t>
+            </w:r>
+          </w:p>
+          <w:p>
+            <w:pPr>
+              <w:spacing w:after="60"/>
+            </w:pPr>
+            <w:r>
+              <w:rPr>
+                <w:rFonts w:ascii="Calibri" w:cs="Calibri" w:eastAsia="Calibri" w:hAnsi="Calibri"/>
+                <w:b/>
+                <w:bCs/>
+                <w:sz w:val="21"/>
+                <w:szCs w:val="21"/>
+              </w:rPr>
+              <w:t xml:space="preserve">= 3x³ + x² + 4x + 7 + 20/(x − 2)</w:t>
+            </w:r>
+          </w:p>
+        </w:tc>
+      </w:tr>
+      <w:tr>
+        <w:trPr>
+          <w:cantSplit/>
+        </w:trPr>
+        <w:tc>
+          <w:tcPr>
+            <w:tcW w:type="dxa" w:w="2700"/>
+            <w:tcBorders>
+              <w:top w:val="single" w:color="8EAADB" w:sz="4"/>
+              <w:left w:val="single" w:color="8EAADB" w:sz="4"/>
+              <w:bottom w:val="single" w:color="8EAADB" w:sz="4"/>
+              <w:right w:val="single" w:color="8EAADB" w:sz="4"/>
+            </w:tcBorders>
+            <w:shd w:fill="EEF3FA" w:color="auto" w:val="clear"/>
+            <w:tcMar>
+              <w:top w:type="dxa" w:w="60"/>
+              <w:left w:type="dxa" w:w="100"/>
+              <w:bottom w:type="dxa" w:w="60"/>
+              <w:right w:type="dxa" w:w="100"/>
+            </w:tcMar>
+          </w:tcPr>
+          <w:p>
+            <w:r>
+              <w:rPr>
+                <w:rFonts w:ascii="Calibri" w:cs="Calibri" w:eastAsia="Calibri" w:hAnsi="Calibri"/>
+                <w:b/>
+                <w:bCs/>
+                <w:color w:val="1F3864"/>
+                <w:sz w:val="21"/>
+                <w:szCs w:val="21"/>
+              </w:rPr>
+              <w:t xml:space="preserve">What about missing terms and negative c?</w:t>
+            </w:r>
+          </w:p>
+        </w:tc>
+        <w:tc>
+          <w:tcPr>
+            <w:tcW w:type="dxa" w:w="6660"/>
+            <w:tcBorders>
+              <w:top w:val="single" w:color="8EAADB" w:sz="4"/>
+              <w:left w:val="single" w:color="8EAADB" w:sz="4"/>
+              <w:bottom w:val="single" w:color="8EAADB" w:sz="4"/>
+              <w:right w:val="single" w:color="8EAADB" w:sz="4"/>
+            </w:tcBorders>
+            <w:tcMar>
+              <w:top w:type="dxa" w:w="60"/>
+              <w:left w:type="dxa" w:w="100"/>
+              <w:bottom w:type="dxa" w:w="60"/>
+              <w:right w:type="dxa" w:w="100"/>
+            </w:tcMar>
+          </w:tcPr>
+          <w:p>
+            <w:pPr>
+              <w:spacing w:after="60"/>
+            </w:pPr>
+            <w:r>
+              <w:rPr>
+                <w:rFonts w:ascii="Calibri" w:cs="Calibri" w:eastAsia="Calibri" w:hAnsi="Calibri"/>
+                <w:b/>
+                <w:bCs/>
+                <w:sz w:val="21"/>
+                <w:szCs w:val="21"/>
+              </w:rPr>
+              <w:t xml:space="preserve">Class example</w:t>
+            </w:r>
+            <w:r>
+              <w:rPr>
+                <w:rFonts w:ascii="Calibri" w:cs="Calibri" w:eastAsia="Calibri" w:hAnsi="Calibri"/>
+                <w:sz w:val="21"/>
+                <w:szCs w:val="21"/>
+              </w:rPr>
+              <w:t xml:space="preserve"> (p⁵ + 8p⁴ + 2p² + 19p + 16) ÷ (p + 8): c = −8, coefficients 1, 8, </w:t>
+            </w:r>
+            <w:r>
+              <w:rPr>
+                <w:rFonts w:ascii="Calibri" w:cs="Calibri" w:eastAsia="Calibri" w:hAnsi="Calibri"/>
+                <w:b/>
+                <w:bCs/>
+                <w:sz w:val="21"/>
+                <w:szCs w:val="21"/>
+              </w:rPr>
+              <w:t xml:space="preserve">0</w:t>
+            </w:r>
+            <w:r>
+              <w:rPr>
+                <w:rFonts w:ascii="Calibri" w:cs="Calibri" w:eastAsia="Calibri" w:hAnsi="Calibri"/>
+                <w:sz w:val="21"/>
+                <w:szCs w:val="21"/>
+              </w:rPr>
+              <w:t xml:space="preserve">, 2, 19, 16.</w:t>
+            </w:r>
+          </w:p>
+          <w:p>
+            <w:pPr>
+              <w:spacing w:after="60"/>
+            </w:pPr>
+            <w:r>
+              <w:rPr>
+                <w:rFonts w:ascii="Calibri" w:cs="Calibri" w:eastAsia="Calibri" w:hAnsi="Calibri"/>
+                <w:sz w:val="21"/>
+                <w:szCs w:val="21"/>
+              </w:rPr>
+              <w:t xml:space="preserve">Bring down 1; 1(−8) = −8, 8 − 8 = 0; 0(−8) = 0, 0 + 0 = 0; 0·(−8) = 0, 2 + 0 = 2; 2(−8) = −16, 19 − 16 = 3; 3(−8) = −24, 16 − 24 = −8</w:t>
+            </w:r>
+          </w:p>
+          <w:p>
+            <w:pPr>
+              <w:spacing w:after="60"/>
+            </w:pPr>
+            <w:r>
+              <w:rPr>
+                <w:rFonts w:ascii="Calibri" w:cs="Calibri" w:eastAsia="Calibri" w:hAnsi="Calibri"/>
+                <w:b/>
+                <w:bCs/>
+                <w:sz w:val="21"/>
+                <w:szCs w:val="21"/>
+              </w:rPr>
+              <w:t xml:space="preserve">= p⁴ + 2p + 3 − 8/(p + 8)</w:t>
+            </w:r>
+            <w:r>
+              <w:rPr>
+                <w:rFonts w:ascii="Calibri" w:cs="Calibri" w:eastAsia="Calibri" w:hAnsi="Calibri"/>
+                <w:sz w:val="21"/>
+                <w:szCs w:val="21"/>
+              </w:rPr>
+              <w:t xml:space="preserve">  (the zero coefficient for p³ is why p³ and p² drop out of the quotient pattern: 1, 0, 0, 2, 3).</w:t>
+            </w:r>
+          </w:p>
+          <w:p>
+            <w:pPr>
+              <w:spacing w:after="60"/>
+            </w:pPr>
+            <w:r>
+              <w:rPr>
+                <w:rFonts w:ascii="Calibri" w:cs="Calibri" w:eastAsia="Calibri" w:hAnsi="Calibri"/>
+                <w:b/>
+                <w:bCs/>
+                <w:sz w:val="21"/>
+                <w:szCs w:val="21"/>
+              </w:rPr>
+              <w:t xml:space="preserve">Another:</w:t>
+            </w:r>
+            <w:r>
+              <w:rPr>
+                <w:rFonts w:ascii="Calibri" w:cs="Calibri" w:eastAsia="Calibri" w:hAnsi="Calibri"/>
+                <w:sz w:val="21"/>
+                <w:szCs w:val="21"/>
+              </w:rPr>
+              <w:t xml:space="preserve"> (x⁴ + 11x³ + 33x² + 24x + 32) ÷ (x + 6), c = −6 → 1, 5, 3, 6, remainder −4 → </w:t>
+            </w:r>
+            <w:r>
+              <w:rPr>
+                <w:rFonts w:ascii="Calibri" w:cs="Calibri" w:eastAsia="Calibri" w:hAnsi="Calibri"/>
+                <w:b/>
+                <w:bCs/>
+                <w:sz w:val="21"/>
+                <w:szCs w:val="21"/>
+              </w:rPr>
+              <w:t xml:space="preserve">x³ + 5x² + 3x + 6 − 4/(x + 6)</w:t>
+            </w:r>
+            <w:r>
+              <w:rPr>
+                <w:rFonts w:ascii="Calibri" w:cs="Calibri" w:eastAsia="Calibri" w:hAnsi="Calibri"/>
+                <w:sz w:val="21"/>
+                <w:szCs w:val="21"/>
+              </w:rPr>
+              <w:t xml:space="preserve">.</w:t>
+            </w:r>
+          </w:p>
+          <w:p>
+            <w:pPr>
+              <w:spacing w:after="60"/>
+            </w:pPr>
+            <w:r>
+              <w:rPr>
+                <w:rFonts w:ascii="Calibri" w:cs="Calibri" w:eastAsia="Calibri" w:hAnsi="Calibri"/>
+                <w:b/>
+                <w:bCs/>
+                <w:sz w:val="21"/>
+                <w:szCs w:val="21"/>
+              </w:rPr>
+              <w:t xml:space="preserve">Another:</w:t>
+            </w:r>
+            <w:r>
+              <w:rPr>
+                <w:rFonts w:ascii="Calibri" w:cs="Calibri" w:eastAsia="Calibri" w:hAnsi="Calibri"/>
+                <w:sz w:val="21"/>
+                <w:szCs w:val="21"/>
+              </w:rPr>
+              <w:t xml:space="preserve"> (6b⁴ + 53b³ + 32b² − 61b + 19) ÷ (b + 8), c = −8 → 6, 5, −8, 3, remainder −5 → </w:t>
+            </w:r>
+            <w:r>
+              <w:rPr>
+                <w:rFonts w:ascii="Calibri" w:cs="Calibri" w:eastAsia="Calibri" w:hAnsi="Calibri"/>
+                <w:b/>
+                <w:bCs/>
+                <w:sz w:val="21"/>
+                <w:szCs w:val="21"/>
+              </w:rPr>
+              <w:t xml:space="preserve">6b³ + 5b² − 8b + 3 − 5/(b + 8)</w:t>
+            </w:r>
+            <w:r>
+              <w:rPr>
+                <w:rFonts w:ascii="Calibri" w:cs="Calibri" w:eastAsia="Calibri" w:hAnsi="Calibri"/>
+                <w:sz w:val="21"/>
+                <w:szCs w:val="21"/>
+              </w:rPr>
+              <w:t xml:space="preserve">. (My arithmetic gives +3 as the last quotient coefficient; the handwritten class page shows a corrected digit there — double-check against your notebook.)</w:t>
+            </w:r>
+          </w:p>
+        </w:tc>
+      </w:tr>
+      <w:tr>
+        <w:trPr>
+          <w:cantSplit/>
+        </w:trPr>
+        <w:tc>
+          <w:tcPr>
+            <w:tcW w:type="dxa" w:w="2700"/>
+            <w:tcBorders>
+              <w:top w:val="single" w:color="8EAADB" w:sz="4"/>
+              <w:left w:val="single" w:color="8EAADB" w:sz="4"/>
+              <w:bottom w:val="single" w:color="8EAADB" w:sz="4"/>
+              <w:right w:val="single" w:color="8EAADB" w:sz="4"/>
+            </w:tcBorders>
+            <w:shd w:fill="EEF3FA" w:color="auto" w:val="clear"/>
+            <w:tcMar>
+              <w:top w:type="dxa" w:w="60"/>
+              <w:left w:type="dxa" w:w="100"/>
+              <w:bottom w:type="dxa" w:w="60"/>
+              <w:right w:type="dxa" w:w="100"/>
+            </w:tcMar>
+          </w:tcPr>
+          <w:p>
+            <w:r>
+              <w:rPr>
+                <w:rFonts w:ascii="Calibri" w:cs="Calibri" w:eastAsia="Calibri" w:hAnsi="Calibri"/>
+                <w:b/>
+                <w:bCs/>
+                <w:color w:val="1F3864"/>
+                <w:sz w:val="21"/>
+                <w:szCs w:val="21"/>
+              </w:rPr>
+              <w:t xml:space="preserve">How does the remainder connect to the Factor Theorem?</w:t>
+            </w:r>
+          </w:p>
+        </w:tc>
+        <w:tc>
+          <w:tcPr>
+            <w:tcW w:type="dxa" w:w="6660"/>
+            <w:tcBorders>
+              <w:top w:val="single" w:color="8EAADB" w:sz="4"/>
+              <w:left w:val="single" w:color="8EAADB" w:sz="4"/>
+              <w:bottom w:val="single" w:color="8EAADB" w:sz="4"/>
+              <w:right w:val="single" w:color="8EAADB" w:sz="4"/>
+            </w:tcBorders>
+            <w:tcMar>
+              <w:top w:type="dxa" w:w="60"/>
+              <w:left w:type="dxa" w:w="100"/>
+              <w:bottom w:type="dxa" w:w="60"/>
+              <w:right w:type="dxa" w:w="100"/>
+            </w:tcMar>
+          </w:tcPr>
+          <w:p>
+            <w:pPr>
+              <w:spacing w:after="60"/>
+            </w:pPr>
+            <w:r>
+              <w:rPr>
+                <w:rFonts w:ascii="Calibri" w:cs="Calibri" w:eastAsia="Calibri" w:hAnsi="Calibri"/>
+                <w:sz w:val="21"/>
+                <w:szCs w:val="21"/>
+              </w:rPr>
+              <w:t xml:space="preserve">Remainder when dividing P(x) by (x − c) equals </w:t>
+            </w:r>
+            <w:r>
+              <w:rPr>
+                <w:rFonts w:ascii="Calibri" w:cs="Calibri" w:eastAsia="Calibri" w:hAnsi="Calibri"/>
+                <w:b/>
+                <w:bCs/>
+                <w:sz w:val="21"/>
+                <w:szCs w:val="21"/>
+              </w:rPr>
+              <w:t xml:space="preserve">P(c)</w:t>
+            </w:r>
+            <w:r>
+              <w:rPr>
+                <w:rFonts w:ascii="Calibri" w:cs="Calibri" w:eastAsia="Calibri" w:hAnsi="Calibri"/>
+                <w:sz w:val="21"/>
+                <w:szCs w:val="21"/>
+              </w:rPr>
+              <w:t xml:space="preserve">. Remainder 0 ⇒ (x − c) is a factor and c is a zero.</w:t>
+            </w:r>
+          </w:p>
+          <w:p>
+            <w:pPr>
+              <w:spacing w:after="60"/>
+            </w:pPr>
+            <w:r>
+              <w:rPr>
+                <w:rFonts w:ascii="Calibri" w:cs="Calibri" w:eastAsia="Calibri" w:hAnsi="Calibri"/>
+                <w:b/>
+                <w:bCs/>
+                <w:sz w:val="21"/>
+                <w:szCs w:val="21"/>
+              </w:rPr>
+              <w:t xml:space="preserve">Station 5</w:t>
+            </w:r>
+            <w:r>
+              <w:rPr>
+                <w:rFonts w:ascii="Calibri" w:cs="Calibri" w:eastAsia="Calibri" w:hAnsi="Calibri"/>
+                <w:sz w:val="21"/>
+                <w:szCs w:val="21"/>
+              </w:rPr>
+              <w:t xml:space="preserve"> P(x) = x⁴ − dx³ + 3x² − 4x − 4, factor (x − 2): P(2) = 16 − 8d + 12 − 8 − 4 = 16 − 8d = 0 → </w:t>
+            </w:r>
+            <w:r>
+              <w:rPr>
+                <w:rFonts w:ascii="Calibri" w:cs="Calibri" w:eastAsia="Calibri" w:hAnsi="Calibri"/>
+                <w:b/>
+                <w:bCs/>
+                <w:sz w:val="21"/>
+                <w:szCs w:val="21"/>
+              </w:rPr>
+              <w:t xml:space="preserve">d = 2</w:t>
+            </w:r>
+            <w:r>
+              <w:rPr>
+                <w:rFonts w:ascii="Calibri" w:cs="Calibri" w:eastAsia="Calibri" w:hAnsi="Calibri"/>
+                <w:sz w:val="21"/>
+                <w:szCs w:val="21"/>
+              </w:rPr>
+              <w:t xml:space="preserve">.</w:t>
+            </w:r>
+          </w:p>
+        </w:tc>
+      </w:tr>
+      <w:tr>
+        <w:trPr>
+          <w:cantSplit/>
+        </w:trPr>
+        <w:tc>
+          <w:tcPr>
+            <w:tcW w:type="dxa" w:w="2700"/>
+            <w:tcBorders>
+              <w:top w:val="single" w:color="8EAADB" w:sz="4"/>
+              <w:left w:val="single" w:color="8EAADB" w:sz="4"/>
+              <w:bottom w:val="single" w:color="8EAADB" w:sz="4"/>
+              <w:right w:val="single" w:color="8EAADB" w:sz="4"/>
+            </w:tcBorders>
+            <w:shd w:fill="EEF3FA" w:color="auto" w:val="clear"/>
+            <w:tcMar>
+              <w:top w:type="dxa" w:w="60"/>
+              <w:left w:type="dxa" w:w="100"/>
+              <w:bottom w:type="dxa" w:w="60"/>
+              <w:right w:type="dxa" w:w="100"/>
+            </w:tcMar>
+          </w:tcPr>
+          <w:p>
+            <w:r>
+              <w:rPr>
+                <w:rFonts w:ascii="Calibri" w:cs="Calibri" w:eastAsia="Calibri" w:hAnsi="Calibri"/>
+                <w:b/>
+                <w:bCs/>
+                <w:color w:val="1F3864"/>
+                <w:sz w:val="21"/>
+                <w:szCs w:val="21"/>
+              </w:rPr>
+              <w:t xml:space="preserve">How do I find all the roots of a cubic?</w:t>
+            </w:r>
+          </w:p>
+        </w:tc>
+        <w:tc>
+          <w:tcPr>
+            <w:tcW w:type="dxa" w:w="6660"/>
+            <w:tcBorders>
+              <w:top w:val="single" w:color="8EAADB" w:sz="4"/>
+              <w:left w:val="single" w:color="8EAADB" w:sz="4"/>
+              <w:bottom w:val="single" w:color="8EAADB" w:sz="4"/>
+              <w:right w:val="single" w:color="8EAADB" w:sz="4"/>
+            </w:tcBorders>
+            <w:tcMar>
+              <w:top w:type="dxa" w:w="60"/>
+              <w:left w:type="dxa" w:w="100"/>
+              <w:bottom w:type="dxa" w:w="60"/>
+              <w:right w:type="dxa" w:w="100"/>
+            </w:tcMar>
+          </w:tcPr>
+          <w:p>
+            <w:pPr>
+              <w:spacing w:after="60"/>
+            </w:pPr>
+            <w:r>
+              <w:rPr>
+                <w:rFonts w:ascii="Calibri" w:cs="Calibri" w:eastAsia="Calibri" w:hAnsi="Calibri"/>
+                <w:b/>
+                <w:bCs/>
+                <w:sz w:val="21"/>
+                <w:szCs w:val="21"/>
+              </w:rPr>
+              <w:t xml:space="preserve">Rational Root Theorem:</w:t>
+            </w:r>
+            <w:r>
+              <w:rPr>
+                <w:rFonts w:ascii="Calibri" w:cs="Calibri" w:eastAsia="Calibri" w:hAnsi="Calibri"/>
+                <w:sz w:val="21"/>
+                <w:szCs w:val="21"/>
+              </w:rPr>
+              <w:t xml:space="preserve"> possible rational roots = ±(factors of constant term) / (factors of leading coefficient). Test candidates with synthetic division; when the remainder is 0, factor out and solve the leftover quadratic.</w:t>
+            </w:r>
+          </w:p>
+          <w:p>
+            <w:pPr>
+              <w:spacing w:after="60"/>
+            </w:pPr>
+            <w:r>
+              <w:rPr>
+                <w:rFonts w:ascii="Calibri" w:cs="Calibri" w:eastAsia="Calibri" w:hAnsi="Calibri"/>
+                <w:b/>
+                <w:bCs/>
+                <w:sz w:val="21"/>
+                <w:szCs w:val="21"/>
+              </w:rPr>
+              <w:t xml:space="preserve">Station 2</w:t>
+            </w:r>
+            <w:r>
+              <w:rPr>
+                <w:rFonts w:ascii="Calibri" w:cs="Calibri" w:eastAsia="Calibri" w:hAnsi="Calibri"/>
+                <w:sz w:val="21"/>
+                <w:szCs w:val="21"/>
+              </w:rPr>
+              <w:t xml:space="preserve"> x³ − 4x² + x + 6 = 0 → possible roots ±1, ±2, ±3, ±6.</w:t>
+            </w:r>
+          </w:p>
+          <w:p>
+            <w:pPr>
+              <w:spacing w:after="60"/>
+            </w:pPr>
+            <w:r>
+              <w:rPr>
+                <w:rFonts w:ascii="Calibri" w:cs="Calibri" w:eastAsia="Calibri" w:hAnsi="Calibri"/>
+                <w:sz w:val="21"/>
+                <w:szCs w:val="21"/>
+              </w:rPr>
+              <w:t xml:space="preserve">Try c = −1: 1 | −4 | 1 | 6 → 1, −5, 6, remainder </w:t>
+            </w:r>
+            <w:r>
+              <w:rPr>
+                <w:rFonts w:ascii="Calibri" w:cs="Calibri" w:eastAsia="Calibri" w:hAnsi="Calibri"/>
+                <w:b/>
+                <w:bCs/>
+                <w:sz w:val="21"/>
+                <w:szCs w:val="21"/>
+              </w:rPr>
+              <w:t xml:space="preserve">0</w:t>
+            </w:r>
+            <w:r>
+              <w:rPr>
+                <w:rFonts w:ascii="Calibri" w:cs="Calibri" w:eastAsia="Calibri" w:hAnsi="Calibri"/>
+                <w:sz w:val="21"/>
+                <w:szCs w:val="21"/>
+              </w:rPr>
+              <w:t xml:space="preserve"> ✓ → (x + 1)(x² − 5x + 6) = (x + 1)(x − 2)(x − 3).</w:t>
+            </w:r>
+          </w:p>
+          <w:p>
+            <w:pPr>
+              <w:spacing w:after="60"/>
+            </w:pPr>
+            <w:r>
+              <w:rPr>
+                <w:rFonts w:ascii="Calibri" w:cs="Calibri" w:eastAsia="Calibri" w:hAnsi="Calibri"/>
+                <w:b/>
+                <w:bCs/>
+                <w:sz w:val="21"/>
+                <w:szCs w:val="21"/>
+              </w:rPr>
+              <w:t xml:space="preserve">Roots: x = −1, 2, 3</w:t>
+            </w:r>
+          </w:p>
+        </w:tc>
+      </w:tr>
+      <w:tr>
+        <w:trPr>
+          <w:cantSplit/>
+        </w:trPr>
+        <w:tc>
+          <w:tcPr>
             <w:tcW w:type="dxa" w:w="9360"/>
             <w:gridSpan w:val="2"/>
             <w:tcBorders>
@@ -2695,7 +3359,513 @@
               <w:bottom w:val="single" w:color="8EAADB" w:sz="4"/>
               <w:right w:val="single" w:color="8EAADB" w:sz="4"/>
             </w:tcBorders>
-            <w:shd w:fill="FFF2CC" w:color="auto" w:val="clear"/>
+            <w:shd w:fill="D9E2F3" w:color="auto" w:val="clear"/>
+            <w:tcMar>
+              <w:top w:type="dxa" w:w="60"/>
+              <w:left w:type="dxa" w:w="100"/>
+              <w:bottom w:type="dxa" w:w="60"/>
+              <w:right w:type="dxa" w:w="100"/>
+            </w:tcMar>
+          </w:tcPr>
+          <w:p>
+            <w:pPr>
+              <w:keepNext/>
+            </w:pPr>
+            <w:r>
+              <w:rPr>
+                <w:rFonts w:ascii="Calibri" w:cs="Calibri" w:eastAsia="Calibri" w:hAnsi="Calibri"/>
+                <w:b/>
+                <w:bCs/>
+                <w:color w:val="1F3864"/>
+                <w:sz w:val="24"/>
+                <w:szCs w:val="24"/>
+              </w:rPr>
+              <w:t xml:space="preserve">7. More Practice (Review Stations)</w:t>
+            </w:r>
+          </w:p>
+        </w:tc>
+      </w:tr>
+      <w:tr>
+        <w:trPr>
+          <w:cantSplit/>
+        </w:trPr>
+        <w:tc>
+          <w:tcPr>
+            <w:tcW w:type="dxa" w:w="2700"/>
+            <w:tcBorders>
+              <w:top w:val="single" w:color="8EAADB" w:sz="4"/>
+              <w:left w:val="single" w:color="8EAADB" w:sz="4"/>
+              <w:bottom w:val="single" w:color="8EAADB" w:sz="4"/>
+              <w:right w:val="single" w:color="8EAADB" w:sz="4"/>
+            </w:tcBorders>
+            <w:shd w:fill="EEF3FA" w:color="auto" w:val="clear"/>
+            <w:tcMar>
+              <w:top w:type="dxa" w:w="60"/>
+              <w:left w:type="dxa" w:w="100"/>
+              <w:bottom w:type="dxa" w:w="60"/>
+              <w:right w:type="dxa" w:w="100"/>
+            </w:tcMar>
+          </w:tcPr>
+          <w:p>
+            <w:r>
+              <w:rPr>
+                <w:rFonts w:ascii="Calibri" w:cs="Calibri" w:eastAsia="Calibri" w:hAnsi="Calibri"/>
+                <w:b/>
+                <w:bCs/>
+                <w:color w:val="1F3864"/>
+                <w:sz w:val="21"/>
+                <w:szCs w:val="21"/>
+              </w:rPr>
+              <w:t xml:space="preserve">Writing a polynomial from zeros in standard form</w:t>
+            </w:r>
+          </w:p>
+        </w:tc>
+        <w:tc>
+          <w:tcPr>
+            <w:tcW w:type="dxa" w:w="6660"/>
+            <w:tcBorders>
+              <w:top w:val="single" w:color="8EAADB" w:sz="4"/>
+              <w:left w:val="single" w:color="8EAADB" w:sz="4"/>
+              <w:bottom w:val="single" w:color="8EAADB" w:sz="4"/>
+              <w:right w:val="single" w:color="8EAADB" w:sz="4"/>
+            </w:tcBorders>
+            <w:tcMar>
+              <w:top w:type="dxa" w:w="60"/>
+              <w:left w:type="dxa" w:w="100"/>
+              <w:bottom w:type="dxa" w:w="60"/>
+              <w:right w:type="dxa" w:w="100"/>
+            </w:tcMar>
+          </w:tcPr>
+          <w:p>
+            <w:pPr>
+              <w:spacing w:after="60"/>
+            </w:pPr>
+            <w:r>
+              <w:rPr>
+                <w:rFonts w:ascii="Calibri" w:cs="Calibri" w:eastAsia="Calibri" w:hAnsi="Calibri"/>
+                <w:b/>
+                <w:bCs/>
+                <w:sz w:val="21"/>
+                <w:szCs w:val="21"/>
+              </w:rPr>
+              <w:t xml:space="preserve">Station 3</w:t>
+            </w:r>
+            <w:r>
+              <w:rPr>
+                <w:rFonts w:ascii="Calibri" w:cs="Calibri" w:eastAsia="Calibri" w:hAnsi="Calibri"/>
+                <w:sz w:val="21"/>
+                <w:szCs w:val="21"/>
+              </w:rPr>
+              <w:t xml:space="preserve"> zeros 0, 3, −1/2: P(x) = x(x − 3)(x + ½) = x(x² − 2.5x − 1.5) = </w:t>
+            </w:r>
+            <w:r>
+              <w:rPr>
+                <w:rFonts w:ascii="Calibri" w:cs="Calibri" w:eastAsia="Calibri" w:hAnsi="Calibri"/>
+                <w:b/>
+                <w:bCs/>
+                <w:sz w:val="21"/>
+                <w:szCs w:val="21"/>
+              </w:rPr>
+              <w:t xml:space="preserve">x³ − 2.5x² − 1.5x</w:t>
+            </w:r>
+            <w:r>
+              <w:rPr>
+                <w:rFonts w:ascii="Calibri" w:cs="Calibri" w:eastAsia="Calibri" w:hAnsi="Calibri"/>
+                <w:sz w:val="21"/>
+                <w:szCs w:val="21"/>
+              </w:rPr>
+              <w:t xml:space="preserve">. Clearing fractions: 2x³ − 5x² − 3x also works (constant multiple).</w:t>
+            </w:r>
+          </w:p>
+        </w:tc>
+      </w:tr>
+      <w:tr>
+        <w:trPr>
+          <w:cantSplit/>
+        </w:trPr>
+        <w:tc>
+          <w:tcPr>
+            <w:tcW w:type="dxa" w:w="2700"/>
+            <w:tcBorders>
+              <w:top w:val="single" w:color="8EAADB" w:sz="4"/>
+              <w:left w:val="single" w:color="8EAADB" w:sz="4"/>
+              <w:bottom w:val="single" w:color="8EAADB" w:sz="4"/>
+              <w:right w:val="single" w:color="8EAADB" w:sz="4"/>
+            </w:tcBorders>
+            <w:shd w:fill="EEF3FA" w:color="auto" w:val="clear"/>
+            <w:tcMar>
+              <w:top w:type="dxa" w:w="60"/>
+              <w:left w:type="dxa" w:w="100"/>
+              <w:bottom w:type="dxa" w:w="60"/>
+              <w:right w:type="dxa" w:w="100"/>
+            </w:tcMar>
+          </w:tcPr>
+          <w:p>
+            <w:r>
+              <w:rPr>
+                <w:rFonts w:ascii="Calibri" w:cs="Calibri" w:eastAsia="Calibri" w:hAnsi="Calibri"/>
+                <w:b/>
+                <w:bCs/>
+                <w:color w:val="1F3864"/>
+                <w:sz w:val="21"/>
+                <w:szCs w:val="21"/>
+              </w:rPr>
+              <w:t xml:space="preserve">Rational equation with extraneous check</w:t>
+            </w:r>
+          </w:p>
+        </w:tc>
+        <w:tc>
+          <w:tcPr>
+            <w:tcW w:type="dxa" w:w="6660"/>
+            <w:tcBorders>
+              <w:top w:val="single" w:color="8EAADB" w:sz="4"/>
+              <w:left w:val="single" w:color="8EAADB" w:sz="4"/>
+              <w:bottom w:val="single" w:color="8EAADB" w:sz="4"/>
+              <w:right w:val="single" w:color="8EAADB" w:sz="4"/>
+            </w:tcBorders>
+            <w:tcMar>
+              <w:top w:type="dxa" w:w="60"/>
+              <w:left w:type="dxa" w:w="100"/>
+              <w:bottom w:type="dxa" w:w="60"/>
+              <w:right w:type="dxa" w:w="100"/>
+            </w:tcMar>
+          </w:tcPr>
+          <w:p>
+            <w:pPr>
+              <w:spacing w:after="60"/>
+            </w:pPr>
+            <w:r>
+              <w:rPr>
+                <w:rFonts w:ascii="Calibri" w:cs="Calibri" w:eastAsia="Calibri" w:hAnsi="Calibri"/>
+                <w:b/>
+                <w:bCs/>
+                <w:sz w:val="21"/>
+                <w:szCs w:val="21"/>
+              </w:rPr>
+              <w:t xml:space="preserve">Station 4</w:t>
+            </w:r>
+            <w:r>
+              <w:rPr>
+                <w:rFonts w:ascii="Calibri" w:cs="Calibri" w:eastAsia="Calibri" w:hAnsi="Calibri"/>
+                <w:sz w:val="21"/>
+                <w:szCs w:val="21"/>
+              </w:rPr>
+              <w:t xml:space="preserve"> (x + 2)/(x − 1) = 4/(x − 2) → (x + 2)(x − 2) = 4(x − 1) → x² − 4 = 4x − 4 → x² − 4x = 0 → x = 0 or 4. Neither makes a denominator 0 (x ≠ 1, 2) ✓ </w:t>
+            </w:r>
+            <w:r>
+              <w:rPr>
+                <w:rFonts w:ascii="Calibri" w:cs="Calibri" w:eastAsia="Calibri" w:hAnsi="Calibri"/>
+                <w:b/>
+                <w:bCs/>
+                <w:sz w:val="21"/>
+                <w:szCs w:val="21"/>
+              </w:rPr>
+              <w:t xml:space="preserve">x = 0, 4</w:t>
+            </w:r>
+            <w:r>
+              <w:rPr>
+                <w:rFonts w:ascii="Calibri" w:cs="Calibri" w:eastAsia="Calibri" w:hAnsi="Calibri"/>
+                <w:sz w:val="21"/>
+                <w:szCs w:val="21"/>
+              </w:rPr>
+              <w:t xml:space="preserve">.</w:t>
+            </w:r>
+          </w:p>
+        </w:tc>
+      </w:tr>
+      <w:tr>
+        <w:trPr>
+          <w:cantSplit/>
+        </w:trPr>
+        <w:tc>
+          <w:tcPr>
+            <w:tcW w:type="dxa" w:w="2700"/>
+            <w:tcBorders>
+              <w:top w:val="single" w:color="8EAADB" w:sz="4"/>
+              <w:left w:val="single" w:color="8EAADB" w:sz="4"/>
+              <w:bottom w:val="single" w:color="8EAADB" w:sz="4"/>
+              <w:right w:val="single" w:color="8EAADB" w:sz="4"/>
+            </w:tcBorders>
+            <w:shd w:fill="EEF3FA" w:color="auto" w:val="clear"/>
+            <w:tcMar>
+              <w:top w:type="dxa" w:w="60"/>
+              <w:left w:type="dxa" w:w="100"/>
+              <w:bottom w:type="dxa" w:w="60"/>
+              <w:right w:type="dxa" w:w="100"/>
+            </w:tcMar>
+          </w:tcPr>
+          <w:p>
+            <w:r>
+              <w:rPr>
+                <w:rFonts w:ascii="Calibri" w:cs="Calibri" w:eastAsia="Calibri" w:hAnsi="Calibri"/>
+                <w:b/>
+                <w:bCs/>
+                <w:color w:val="1F3864"/>
+                <w:sz w:val="21"/>
+                <w:szCs w:val="21"/>
+              </w:rPr>
+              <w:t xml:space="preserve">Quadratics two ways + features</w:t>
+            </w:r>
+          </w:p>
+        </w:tc>
+        <w:tc>
+          <w:tcPr>
+            <w:tcW w:type="dxa" w:w="6660"/>
+            <w:tcBorders>
+              <w:top w:val="single" w:color="8EAADB" w:sz="4"/>
+              <w:left w:val="single" w:color="8EAADB" w:sz="4"/>
+              <w:bottom w:val="single" w:color="8EAADB" w:sz="4"/>
+              <w:right w:val="single" w:color="8EAADB" w:sz="4"/>
+            </w:tcBorders>
+            <w:tcMar>
+              <w:top w:type="dxa" w:w="60"/>
+              <w:left w:type="dxa" w:w="100"/>
+              <w:bottom w:type="dxa" w:w="60"/>
+              <w:right w:type="dxa" w:w="100"/>
+            </w:tcMar>
+          </w:tcPr>
+          <w:p>
+            <w:pPr>
+              <w:spacing w:after="60"/>
+            </w:pPr>
+            <w:r>
+              <w:rPr>
+                <w:rFonts w:ascii="Calibri" w:cs="Calibri" w:eastAsia="Calibri" w:hAnsi="Calibri"/>
+                <w:b/>
+                <w:bCs/>
+                <w:sz w:val="21"/>
+                <w:szCs w:val="21"/>
+              </w:rPr>
+              <w:t xml:space="preserve">Station 7</w:t>
+            </w:r>
+            <w:r>
+              <w:rPr>
+                <w:rFonts w:ascii="Calibri" w:cs="Calibri" w:eastAsia="Calibri" w:hAnsi="Calibri"/>
+                <w:sz w:val="21"/>
+                <w:szCs w:val="21"/>
+              </w:rPr>
+              <w:t xml:space="preserve"> x² − 2x − 8 = (x − 4)(x + 2) → x = 4, −2. x² − 6x + 4: x = (6 ± √20)/2 = </w:t>
+            </w:r>
+            <w:r>
+              <w:rPr>
+                <w:rFonts w:ascii="Calibri" w:cs="Calibri" w:eastAsia="Calibri" w:hAnsi="Calibri"/>
+                <w:b/>
+                <w:bCs/>
+                <w:sz w:val="21"/>
+                <w:szCs w:val="21"/>
+              </w:rPr>
+              <w:t xml:space="preserve">3 ± √5</w:t>
+            </w:r>
+            <w:r>
+              <w:rPr>
+                <w:rFonts w:ascii="Calibri" w:cs="Calibri" w:eastAsia="Calibri" w:hAnsi="Calibri"/>
+                <w:sz w:val="21"/>
+                <w:szCs w:val="21"/>
+              </w:rPr>
+              <w:t xml:space="preserve">.</w:t>
+            </w:r>
+          </w:p>
+          <w:p>
+            <w:pPr>
+              <w:spacing w:after="60"/>
+            </w:pPr>
+            <w:r>
+              <w:rPr>
+                <w:rFonts w:ascii="Calibri" w:cs="Calibri" w:eastAsia="Calibri" w:hAnsi="Calibri"/>
+                <w:b/>
+                <w:bCs/>
+                <w:sz w:val="21"/>
+                <w:szCs w:val="21"/>
+              </w:rPr>
+              <w:t xml:space="preserve">Station 8</w:t>
+            </w:r>
+            <w:r>
+              <w:rPr>
+                <w:rFonts w:ascii="Calibri" w:cs="Calibri" w:eastAsia="Calibri" w:hAnsi="Calibri"/>
+                <w:sz w:val="21"/>
+                <w:szCs w:val="21"/>
+              </w:rPr>
+              <w:t xml:space="preserve"> f(x) = −x² + 6x − 5: vertex x = −b/2a = 3, f(3) = 4 → </w:t>
+            </w:r>
+            <w:r>
+              <w:rPr>
+                <w:rFonts w:ascii="Calibri" w:cs="Calibri" w:eastAsia="Calibri" w:hAnsi="Calibri"/>
+                <w:b/>
+                <w:bCs/>
+                <w:sz w:val="21"/>
+                <w:szCs w:val="21"/>
+              </w:rPr>
+              <w:t xml:space="preserve">(3, 4)</w:t>
+            </w:r>
+            <w:r>
+              <w:rPr>
+                <w:rFonts w:ascii="Calibri" w:cs="Calibri" w:eastAsia="Calibri" w:hAnsi="Calibri"/>
+                <w:sz w:val="21"/>
+                <w:szCs w:val="21"/>
+              </w:rPr>
+              <w:t xml:space="preserve">; x-intercepts 1 and 5; y-intercept −5; domain all reals; range y ≤ 4.</w:t>
+            </w:r>
+          </w:p>
+          <w:p>
+            <w:pPr>
+              <w:spacing w:after="60"/>
+            </w:pPr>
+            <w:r>
+              <w:rPr>
+                <w:rFonts w:ascii="Calibri" w:cs="Calibri" w:eastAsia="Calibri" w:hAnsi="Calibri"/>
+                <w:b/>
+                <w:bCs/>
+                <w:sz w:val="21"/>
+                <w:szCs w:val="21"/>
+              </w:rPr>
+              <w:t xml:space="preserve">Station 6</w:t>
+            </w:r>
+            <w:r>
+              <w:rPr>
+                <w:rFonts w:ascii="Calibri" w:cs="Calibri" w:eastAsia="Calibri" w:hAnsi="Calibri"/>
+                <w:sz w:val="21"/>
+                <w:szCs w:val="21"/>
+              </w:rPr>
+              <w:t xml:space="preserve"> negative leading coeff + odd degree + 3 real zeros (e.g. −x³ + …): as x → −∞, f(x) → +∞; as x → +∞, f(x) → −∞.</w:t>
+            </w:r>
+          </w:p>
+        </w:tc>
+      </w:tr>
+      <w:tr>
+        <w:trPr>
+          <w:cantSplit/>
+        </w:trPr>
+        <w:tc>
+          <w:tcPr>
+            <w:tcW w:type="dxa" w:w="2700"/>
+            <w:tcBorders>
+              <w:top w:val="single" w:color="8EAADB" w:sz="4"/>
+              <w:left w:val="single" w:color="8EAADB" w:sz="4"/>
+              <w:bottom w:val="single" w:color="8EAADB" w:sz="4"/>
+              <w:right w:val="single" w:color="8EAADB" w:sz="4"/>
+            </w:tcBorders>
+            <w:shd w:fill="EEF3FA" w:color="auto" w:val="clear"/>
+            <w:tcMar>
+              <w:top w:type="dxa" w:w="60"/>
+              <w:left w:type="dxa" w:w="100"/>
+              <w:bottom w:type="dxa" w:w="60"/>
+              <w:right w:type="dxa" w:w="100"/>
+            </w:tcMar>
+          </w:tcPr>
+          <w:p>
+            <w:r>
+              <w:rPr>
+                <w:rFonts w:ascii="Calibri" w:cs="Calibri" w:eastAsia="Calibri" w:hAnsi="Calibri"/>
+                <w:b/>
+                <w:bCs/>
+                <w:color w:val="1F3864"/>
+                <w:sz w:val="21"/>
+                <w:szCs w:val="21"/>
+              </w:rPr>
+              <w:t xml:space="preserve">Factoring practice (Kuta worksheet)</w:t>
+            </w:r>
+          </w:p>
+        </w:tc>
+        <w:tc>
+          <w:tcPr>
+            <w:tcW w:type="dxa" w:w="6660"/>
+            <w:tcBorders>
+              <w:top w:val="single" w:color="8EAADB" w:sz="4"/>
+              <w:left w:val="single" w:color="8EAADB" w:sz="4"/>
+              <w:bottom w:val="single" w:color="8EAADB" w:sz="4"/>
+              <w:right w:val="single" w:color="8EAADB" w:sz="4"/>
+            </w:tcBorders>
+            <w:tcMar>
+              <w:top w:type="dxa" w:w="60"/>
+              <w:left w:type="dxa" w:w="100"/>
+              <w:bottom w:type="dxa" w:w="60"/>
+              <w:right w:type="dxa" w:w="100"/>
+            </w:tcMar>
+          </w:tcPr>
+          <w:p>
+            <w:pPr>
+              <w:spacing w:after="60"/>
+            </w:pPr>
+            <w:r>
+              <w:rPr>
+                <w:rFonts w:ascii="Calibri" w:cs="Calibri" w:eastAsia="Calibri" w:hAnsi="Calibri"/>
+                <w:sz w:val="21"/>
+                <w:szCs w:val="21"/>
+              </w:rPr>
+              <w:t xml:space="preserve">Move everything to one side first, then factor: </w:t>
+            </w:r>
+            <w:r>
+              <w:rPr>
+                <w:rFonts w:ascii="Calibri" w:cs="Calibri" w:eastAsia="Calibri" w:hAnsi="Calibri"/>
+                <w:b/>
+                <w:bCs/>
+                <w:sz w:val="21"/>
+                <w:szCs w:val="21"/>
+              </w:rPr>
+              <w:t xml:space="preserve">n² + 8n = −15</w:t>
+            </w:r>
+            <w:r>
+              <w:rPr>
+                <w:rFonts w:ascii="Calibri" w:cs="Calibri" w:eastAsia="Calibri" w:hAnsi="Calibri"/>
+                <w:sz w:val="21"/>
+                <w:szCs w:val="21"/>
+              </w:rPr>
+              <w:t xml:space="preserve"> → (n + 3)(n + 5) = 0 → n = −5, −3. </w:t>
+            </w:r>
+            <w:r>
+              <w:rPr>
+                <w:rFonts w:ascii="Calibri" w:cs="Calibri" w:eastAsia="Calibri" w:hAnsi="Calibri"/>
+                <w:b/>
+                <w:bCs/>
+                <w:sz w:val="21"/>
+                <w:szCs w:val="21"/>
+              </w:rPr>
+              <w:t xml:space="preserve">10b² = 27b − 18</w:t>
+            </w:r>
+            <w:r>
+              <w:rPr>
+                <w:rFonts w:ascii="Calibri" w:cs="Calibri" w:eastAsia="Calibri" w:hAnsi="Calibri"/>
+                <w:sz w:val="21"/>
+                <w:szCs w:val="21"/>
+              </w:rPr>
+              <w:t xml:space="preserve"> → 10b² − 27b + 18 = 0 → (5b − 6)(2b − 3) = 0 → b = 6/5, 3/2. </w:t>
+            </w:r>
+            <w:r>
+              <w:rPr>
+                <w:rFonts w:ascii="Calibri" w:cs="Calibri" w:eastAsia="Calibri" w:hAnsi="Calibri"/>
+                <w:b/>
+                <w:bCs/>
+                <w:sz w:val="21"/>
+                <w:szCs w:val="21"/>
+              </w:rPr>
+              <w:t xml:space="preserve">7r² − 14r = −7</w:t>
+            </w:r>
+            <w:r>
+              <w:rPr>
+                <w:rFonts w:ascii="Calibri" w:cs="Calibri" w:eastAsia="Calibri" w:hAnsi="Calibri"/>
+                <w:sz w:val="21"/>
+                <w:szCs w:val="21"/>
+              </w:rPr>
+              <w:t xml:space="preserve"> → 7(r − 1)² = 0 → r = 1 (double root).</w:t>
+            </w:r>
+          </w:p>
+        </w:tc>
+      </w:tr>
+      <w:tr>
+        <w:trPr>
+          <w:cantSplit/>
+        </w:trPr>
+        <w:tc>
+          <w:tcPr>
+            <w:tcW w:type="dxa" w:w="9360"/>
+            <w:gridSpan w:val="2"/>
+            <w:tcBorders>
+              <w:top w:val="single" w:color="8EAADB" w:sz="4"/>
+              <w:left w:val="single" w:color="8EAADB" w:sz="4"/>
+              <w:bottom w:val="single" w:color="8EAADB" w:sz="4"/>
+              <w:right w:val="single" w:color="8EAADB" w:sz="4"/>
+            </w:tcBorders>
+            <w:shd w:fill="E2EFDA" w:color="auto" w:val="clear"/>
             <w:tcMar>
               <w:top w:type="dxa" w:w="60"/>
               <w:left w:type="dxa" w:w="100"/>
@@ -2713,6 +3883,285 @@
                 <w:sz w:val="22"/>
                 <w:szCs w:val="22"/>
               </w:rPr>
+              <w:t xml:space="preserve">MEMORY TRICKS</w:t>
+            </w:r>
+          </w:p>
+          <w:p>
+            <w:pPr>
+              <w:spacing w:after="40"/>
+              <w:ind w:left="240" w:hanging="180"/>
+            </w:pPr>
+            <w:r>
+              <w:rPr>
+                <w:rFonts w:ascii="Calibri" w:cs="Calibri" w:eastAsia="Calibri" w:hAnsi="Calibri"/>
+                <w:sz w:val="21"/>
+                <w:szCs w:val="21"/>
+              </w:rPr>
+              <w:t xml:space="preserve">• </w:t>
+            </w:r>
+            <w:r>
+              <w:rPr>
+                <w:rFonts w:ascii="Calibri" w:cs="Calibri" w:eastAsia="Calibri" w:hAnsi="Calibri"/>
+                <w:b/>
+                <w:bCs/>
+                <w:sz w:val="21"/>
+                <w:szCs w:val="21"/>
+              </w:rPr>
+              <w:t xml:space="preserve">Factor ↔ zero</w:t>
+            </w:r>
+            <w:r>
+              <w:rPr>
+                <w:rFonts w:ascii="Calibri" w:cs="Calibri" w:eastAsia="Calibri" w:hAnsi="Calibri"/>
+                <w:sz w:val="21"/>
+                <w:szCs w:val="21"/>
+              </w:rPr>
+              <w:t xml:space="preserve">: (x − 3) means zero at x = </w:t>
+            </w:r>
+            <w:r>
+              <w:rPr>
+                <w:rFonts w:ascii="Calibri" w:cs="Calibri" w:eastAsia="Calibri" w:hAnsi="Calibri"/>
+                <w:b/>
+                <w:bCs/>
+                <w:sz w:val="21"/>
+                <w:szCs w:val="21"/>
+              </w:rPr>
+              <w:t xml:space="preserve">+</w:t>
+            </w:r>
+            <w:r>
+              <w:rPr>
+                <w:rFonts w:ascii="Calibri" w:cs="Calibri" w:eastAsia="Calibri" w:hAnsi="Calibri"/>
+                <w:sz w:val="21"/>
+                <w:szCs w:val="21"/>
+              </w:rPr>
+              <w:t xml:space="preserve">3 — flip the sign.</w:t>
+            </w:r>
+          </w:p>
+          <w:p>
+            <w:pPr>
+              <w:spacing w:after="40"/>
+              <w:ind w:left="240" w:hanging="180"/>
+            </w:pPr>
+            <w:r>
+              <w:rPr>
+                <w:rFonts w:ascii="Calibri" w:cs="Calibri" w:eastAsia="Calibri" w:hAnsi="Calibri"/>
+                <w:sz w:val="21"/>
+                <w:szCs w:val="21"/>
+              </w:rPr>
+              <w:t xml:space="preserve">• </w:t>
+            </w:r>
+            <w:r>
+              <w:rPr>
+                <w:rFonts w:ascii="Calibri" w:cs="Calibri" w:eastAsia="Calibri" w:hAnsi="Calibri"/>
+                <w:b/>
+                <w:bCs/>
+                <w:sz w:val="21"/>
+                <w:szCs w:val="21"/>
+              </w:rPr>
+              <w:t xml:space="preserve">Even = Equal ends</w:t>
+            </w:r>
+            <w:r>
+              <w:rPr>
+                <w:rFonts w:ascii="Calibri" w:cs="Calibri" w:eastAsia="Calibri" w:hAnsi="Calibri"/>
+                <w:sz w:val="21"/>
+                <w:szCs w:val="21"/>
+              </w:rPr>
+              <w:t xml:space="preserve">, Odd = Opposite ends.</w:t>
+            </w:r>
+          </w:p>
+          <w:p>
+            <w:pPr>
+              <w:spacing w:after="40"/>
+              <w:ind w:left="240" w:hanging="180"/>
+            </w:pPr>
+            <w:r>
+              <w:rPr>
+                <w:rFonts w:ascii="Calibri" w:cs="Calibri" w:eastAsia="Calibri" w:hAnsi="Calibri"/>
+                <w:sz w:val="21"/>
+                <w:szCs w:val="21"/>
+              </w:rPr>
+              <w:t xml:space="preserve">• </w:t>
+            </w:r>
+            <w:r>
+              <w:rPr>
+                <w:rFonts w:ascii="Calibri" w:cs="Calibri" w:eastAsia="Calibri" w:hAnsi="Calibri"/>
+                <w:b/>
+                <w:bCs/>
+                <w:sz w:val="21"/>
+                <w:szCs w:val="21"/>
+              </w:rPr>
+              <w:t xml:space="preserve">Even multiplicity = bounce</w:t>
+            </w:r>
+            <w:r>
+              <w:rPr>
+                <w:rFonts w:ascii="Calibri" w:cs="Calibri" w:eastAsia="Calibri" w:hAnsi="Calibri"/>
+                <w:sz w:val="21"/>
+                <w:szCs w:val="21"/>
+              </w:rPr>
+              <w:t xml:space="preserve">, odd = cross.</w:t>
+            </w:r>
+          </w:p>
+          <w:p>
+            <w:pPr>
+              <w:spacing w:after="40"/>
+              <w:ind w:left="240" w:hanging="180"/>
+            </w:pPr>
+            <w:r>
+              <w:rPr>
+                <w:rFonts w:ascii="Calibri" w:cs="Calibri" w:eastAsia="Calibri" w:hAnsi="Calibri"/>
+                <w:sz w:val="21"/>
+                <w:szCs w:val="21"/>
+              </w:rPr>
+              <w:t xml:space="preserve">• </w:t>
+            </w:r>
+            <w:r>
+              <w:rPr>
+                <w:rFonts w:ascii="Calibri" w:cs="Calibri" w:eastAsia="Calibri" w:hAnsi="Calibri"/>
+                <w:b/>
+                <w:bCs/>
+                <w:sz w:val="21"/>
+                <w:szCs w:val="21"/>
+              </w:rPr>
+              <w:t xml:space="preserve">Quadratic formula song</w:t>
+            </w:r>
+            <w:r>
+              <w:rPr>
+                <w:rFonts w:ascii="Calibri" w:cs="Calibri" w:eastAsia="Calibri" w:hAnsi="Calibri"/>
+                <w:sz w:val="21"/>
+                <w:szCs w:val="21"/>
+              </w:rPr>
+              <w:t xml:space="preserve">: "x equals negative b, plus or minus the square root of b squared minus 4ac, all over 2a."</w:t>
+            </w:r>
+          </w:p>
+          <w:p>
+            <w:pPr>
+              <w:spacing w:after="40"/>
+              <w:ind w:left="240" w:hanging="180"/>
+            </w:pPr>
+            <w:r>
+              <w:rPr>
+                <w:rFonts w:ascii="Calibri" w:cs="Calibri" w:eastAsia="Calibri" w:hAnsi="Calibri"/>
+                <w:sz w:val="21"/>
+                <w:szCs w:val="21"/>
+              </w:rPr>
+              <w:t xml:space="preserve">• </w:t>
+            </w:r>
+            <w:r>
+              <w:rPr>
+                <w:rFonts w:ascii="Calibri" w:cs="Calibri" w:eastAsia="Calibri" w:hAnsi="Calibri"/>
+                <w:b/>
+                <w:bCs/>
+                <w:sz w:val="21"/>
+                <w:szCs w:val="21"/>
+              </w:rPr>
+              <w:t xml:space="preserve">Set = 0 before factoring</w:t>
+            </w:r>
+            <w:r>
+              <w:rPr>
+                <w:rFonts w:ascii="Calibri" w:cs="Calibri" w:eastAsia="Calibri" w:hAnsi="Calibri"/>
+                <w:sz w:val="21"/>
+                <w:szCs w:val="21"/>
+              </w:rPr>
+              <w:t xml:space="preserve"> — no zero, no zero-product rule.</w:t>
+            </w:r>
+          </w:p>
+          <w:p>
+            <w:pPr>
+              <w:spacing w:after="40"/>
+              <w:ind w:left="240" w:hanging="180"/>
+            </w:pPr>
+            <w:r>
+              <w:rPr>
+                <w:rFonts w:ascii="Calibri" w:cs="Calibri" w:eastAsia="Calibri" w:hAnsi="Calibri"/>
+                <w:sz w:val="21"/>
+                <w:szCs w:val="21"/>
+              </w:rPr>
+              <w:t xml:space="preserve">• </w:t>
+            </w:r>
+            <w:r>
+              <w:rPr>
+                <w:rFonts w:ascii="Calibri" w:cs="Calibri" w:eastAsia="Calibri" w:hAnsi="Calibri"/>
+                <w:b/>
+                <w:bCs/>
+                <w:sz w:val="21"/>
+                <w:szCs w:val="21"/>
+              </w:rPr>
+              <w:t xml:space="preserve">Factor Theorem</w:t>
+            </w:r>
+            <w:r>
+              <w:rPr>
+                <w:rFonts w:ascii="Calibri" w:cs="Calibri" w:eastAsia="Calibri" w:hAnsi="Calibri"/>
+                <w:sz w:val="21"/>
+                <w:szCs w:val="21"/>
+              </w:rPr>
+              <w:t xml:space="preserve">: (x − c) is a factor ⇔ plug in c, get 0.</w:t>
+            </w:r>
+          </w:p>
+          <w:p>
+            <w:pPr>
+              <w:spacing w:after="40"/>
+              <w:ind w:left="240" w:hanging="180"/>
+            </w:pPr>
+            <w:r>
+              <w:rPr>
+                <w:rFonts w:ascii="Calibri" w:cs="Calibri" w:eastAsia="Calibri" w:hAnsi="Calibri"/>
+                <w:sz w:val="21"/>
+                <w:szCs w:val="21"/>
+              </w:rPr>
+              <w:t xml:space="preserve">• </w:t>
+            </w:r>
+            <w:r>
+              <w:rPr>
+                <w:rFonts w:ascii="Calibri" w:cs="Calibri" w:eastAsia="Calibri" w:hAnsi="Calibri"/>
+                <w:b/>
+                <w:bCs/>
+                <w:sz w:val="21"/>
+                <w:szCs w:val="21"/>
+              </w:rPr>
+              <w:t xml:space="preserve">Synthetic division</w:t>
+            </w:r>
+            <w:r>
+              <w:rPr>
+                <w:rFonts w:ascii="Calibri" w:cs="Calibri" w:eastAsia="Calibri" w:hAnsi="Calibri"/>
+                <w:sz w:val="21"/>
+                <w:szCs w:val="21"/>
+              </w:rPr>
+              <w:t xml:space="preserve">: divisor x − c → use c (flip the sign); Bring down, Multiply, Add, repeat; 0 for missing terms.</w:t>
+            </w:r>
+          </w:p>
+        </w:tc>
+      </w:tr>
+      <w:tr>
+        <w:trPr>
+          <w:cantSplit/>
+        </w:trPr>
+        <w:tc>
+          <w:tcPr>
+            <w:tcW w:type="dxa" w:w="9360"/>
+            <w:gridSpan w:val="2"/>
+            <w:tcBorders>
+              <w:top w:val="single" w:color="8EAADB" w:sz="4"/>
+              <w:left w:val="single" w:color="8EAADB" w:sz="4"/>
+              <w:bottom w:val="single" w:color="8EAADB" w:sz="4"/>
+              <w:right w:val="single" w:color="8EAADB" w:sz="4"/>
+            </w:tcBorders>
+            <w:shd w:fill="FFF2CC" w:color="auto" w:val="clear"/>
+            <w:tcMar>
+              <w:top w:type="dxa" w:w="60"/>
+              <w:left w:type="dxa" w:w="100"/>
+              <w:bottom w:type="dxa" w:w="60"/>
+              <w:right w:type="dxa" w:w="100"/>
+            </w:tcMar>
+          </w:tcPr>
+          <w:p>
+            <w:r>
+              <w:rPr>
+                <w:rFonts w:ascii="Calibri" w:cs="Calibri" w:eastAsia="Calibri" w:hAnsi="Calibri"/>
+                <w:b/>
+                <w:bCs/>
+                <w:color w:val="1F3864"/>
+                <w:sz w:val="22"/>
+                <w:szCs w:val="22"/>
+              </w:rPr>
               <w:t xml:space="preserve">SUMMARY</w:t>
             </w:r>
           </w:p>
@@ -2780,7 +4229,7 @@
                 <w:sz w:val="21"/>
                 <w:szCs w:val="21"/>
               </w:rPr>
-              <w:t xml:space="preserve"> (zeros are x-intercepts, multiplicity decides cross vs. bounce, degree and leading coefficient set end behavior). Quadratics are solved by factoring or the quadratic formula; the Factor Theorem lets you find an unknown coefficient by plugging in a known zero.</w:t>
+              <w:t xml:space="preserve"> (zeros are x-intercepts, multiplicity decides cross vs. bounce, degree and leading coefficient set end behavior). Quadratics are solved by factoring or the quadratic formula; the Factor Theorem lets you find an unknown coefficient by plugging in a known zero, and synthetic division (with the Rational Root Theorem) lets you test zeros and break a cubic into factors.</w:t>
             </w:r>
           </w:p>
         </w:tc>

</xml_diff>